<commit_message>
[Project][v0.8.0] 100% VGA đã cập nhật
</commit_message>
<xml_diff>
--- a/02_Handbook/Volume IV_Peripherals_and_IO.docx
+++ b/02_Handbook/Volume IV_Peripherals_and_IO.docx
@@ -2201,6 +2201,12 @@
             <w:insideH w:val="single" w:color="auto" w:sz="4" w:space="0"/>
             <w:insideV w:val="single" w:color="auto" w:sz="4" w:space="0"/>
           </w:tblBorders>
+          <w:tblCellMar>
+            <w:top w:w="0" w:type="dxa"/>
+            <w:left w:w="10" w:type="dxa"/>
+            <w:bottom w:w="0" w:type="dxa"/>
+            <w:right w:w="10" w:type="dxa"/>
+          </w:tblCellMar>
         </w:tblPrEx>
         <w:trPr>
           <w:tblHeader/>
@@ -3575,16 +3581,18 @@
             <w:pPr>
               <w:jc w:val="left"/>
             </w:pPr>
-            <w:r>
-              <w:rPr>
-                <w:rFonts w:ascii="Calibri" w:hAnsi="Calibri" w:eastAsia="Calibri" w:cs="Calibri"/>
-                <w:b w:val="0"/>
-                <w:bCs w:val="0"/>
-                <w:color w:val="000000"/>
-                <w:sz w:val="20"/>
-                <w:szCs w:val="20"/>
-              </w:rPr>
-              <w:t>03_Resources/ hoặc 04_Projects/</w:t>
+            <w:bookmarkStart w:id="0" w:name="_GoBack"/>
+            <w:bookmarkEnd w:id="0"/>
+            <w:r>
+              <w:rPr>
+                <w:rFonts w:ascii="Calibri" w:hAnsi="Calibri" w:eastAsia="Calibri" w:cs="Calibri"/>
+                <w:b w:val="0"/>
+                <w:bCs w:val="0"/>
+                <w:color w:val="000000"/>
+                <w:sz w:val="20"/>
+                <w:szCs w:val="20"/>
+              </w:rPr>
+              <w:t>04_Projects/</w:t>
             </w:r>
             <w:r>
               <w:rPr>
@@ -3663,7 +3671,7 @@
                 <w:szCs w:val="20"/>
                 <w:lang w:val="en-US"/>
               </w:rPr>
-              <w:t>, chua du</w:t>
+              <w:t>,</w:t>
             </w:r>
           </w:p>
         </w:tc>
@@ -4171,12 +4179,6 @@
             <w:insideH w:val="single" w:color="auto" w:sz="4" w:space="0"/>
             <w:insideV w:val="single" w:color="auto" w:sz="4" w:space="0"/>
           </w:tblBorders>
-          <w:tblCellMar>
-            <w:top w:w="0" w:type="dxa"/>
-            <w:left w:w="10" w:type="dxa"/>
-            <w:bottom w:w="0" w:type="dxa"/>
-            <w:right w:w="10" w:type="dxa"/>
-          </w:tblCellMar>
         </w:tblPrEx>
         <w:trPr>
           <w:tblHeader/>
@@ -6319,6 +6321,12 @@
             <w:insideH w:val="single" w:color="auto" w:sz="4" w:space="0"/>
             <w:insideV w:val="single" w:color="auto" w:sz="4" w:space="0"/>
           </w:tblBorders>
+          <w:tblCellMar>
+            <w:top w:w="0" w:type="dxa"/>
+            <w:left w:w="10" w:type="dxa"/>
+            <w:bottom w:w="0" w:type="dxa"/>
+            <w:right w:w="10" w:type="dxa"/>
+          </w:tblCellMar>
         </w:tblPrEx>
         <w:trPr>
           <w:tblHeader/>
@@ -6518,12 +6526,6 @@
             <w:insideH w:val="single" w:color="auto" w:sz="4" w:space="0"/>
             <w:insideV w:val="single" w:color="auto" w:sz="4" w:space="0"/>
           </w:tblBorders>
-          <w:tblCellMar>
-            <w:top w:w="0" w:type="dxa"/>
-            <w:left w:w="10" w:type="dxa"/>
-            <w:bottom w:w="0" w:type="dxa"/>
-            <w:right w:w="10" w:type="dxa"/>
-          </w:tblCellMar>
         </w:tblPrEx>
         <w:tc>
           <w:tcPr>
@@ -7402,7 +7404,7 @@
                 <w:szCs w:val="20"/>
                 <w:lang w:val="en-US"/>
               </w:rPr>
-              <w:t>85</w:t>
+              <w:t>100</w:t>
             </w:r>
             <w:r>
               <w:rPr>
@@ -7414,44 +7416,6 @@
                 <w:szCs w:val="20"/>
               </w:rPr>
               <w:t>%</w:t>
-            </w:r>
-            <w:r>
-              <w:rPr>
-                <w:rFonts w:hint="default" w:cs="Calibri"/>
-                <w:b w:val="0"/>
-                <w:bCs w:val="0"/>
-                <w:color w:val="000000"/>
-                <w:sz w:val="20"/>
-                <w:szCs w:val="20"/>
-                <w:lang w:val="en-US"/>
-              </w:rPr>
-              <w:t xml:space="preserve"> (C</w:t>
-            </w:r>
-            <w:r>
-              <w:rPr>
-                <w:rFonts w:hint="default" w:cs="Calibri"/>
-                <w:b w:val="0"/>
-                <w:bCs w:val="0"/>
-                <w:color w:val="000000"/>
-                <w:sz w:val="20"/>
-                <w:szCs w:val="20"/>
-                <w:lang w:val="vi-VN"/>
-              </w:rPr>
-              <w:t xml:space="preserve">ần cắm VGA xuất ra màn và chụp ảnh thực tế </w:t>
-            </w:r>
-            <w:bookmarkStart w:id="0" w:name="_GoBack"/>
-            <w:bookmarkEnd w:id="0"/>
-            <w:r>
-              <w:rPr>
-                <w:rFonts w:hint="default" w:cs="Calibri"/>
-                <w:b w:val="0"/>
-                <w:bCs w:val="0"/>
-                <w:color w:val="000000"/>
-                <w:sz w:val="20"/>
-                <w:szCs w:val="20"/>
-                <w:lang w:val="en-US"/>
-              </w:rPr>
-              <w:t>)</w:t>
             </w:r>
           </w:p>
         </w:tc>

</xml_diff>